<commit_message>
Game 19 fix 7
</commit_message>
<xml_diff>
--- a/Strategy/Commandos Behind Enemy Lines (332 MB)/3-Media (78.7 MB)/3-Video/3-Gameplay/Spek/Source.docx
+++ b/Strategy/Commandos Behind Enemy Lines (332 MB)/3-Media (78.7 MB)/3-Video/3-Gameplay/Spek/Source.docx
@@ -24,7 +24,19 @@
         <w:t>: [</w:t>
       </w:r>
       <w:r>
-        <w:t>Commandos- Behind Enemy Lines -- Mission 1- Baptism of Fire.mp4</w:t>
+        <w:t>Commandos</w:t>
+      </w:r>
+      <w:r>
+        <w:t>_</w:t>
+      </w:r>
+      <w:r>
+        <w:t xml:space="preserve"> Behind Enemy Lines -- Mission 1</w:t>
+      </w:r>
+      <w:r>
+        <w:t>_</w:t>
+      </w:r>
+      <w:r>
+        <w:t xml:space="preserve"> Baptism of Fire.mp4</w:t>
       </w:r>
       <w:r>
         <w:t>] [</w:t>
@@ -785,7 +797,19 @@
         <w:t>: [</w:t>
       </w:r>
       <w:r>
-        <w:t>Commandos- Behind Enemy Lines -- Mission 4- Restore Pride</w:t>
+        <w:t>Commandos</w:t>
+      </w:r>
+      <w:r>
+        <w:t>_</w:t>
+      </w:r>
+      <w:r>
+        <w:t xml:space="preserve"> Behind Enemy Lines -- Mission 4</w:t>
+      </w:r>
+      <w:r>
+        <w:t>_</w:t>
+      </w:r>
+      <w:r>
+        <w:t xml:space="preserve"> Restore Pride</w:t>
       </w:r>
       <w:r>
         <w:t>.mp4</w:t>
@@ -1255,7 +1279,19 @@
         <w:t>: [</w:t>
       </w:r>
       <w:r>
-        <w:t>Commandos- Behind Enemy Lines -- Mission 6- Menace of the Leopold</w:t>
+        <w:t>Commandos</w:t>
+      </w:r>
+      <w:r>
+        <w:t>_</w:t>
+      </w:r>
+      <w:r>
+        <w:t xml:space="preserve"> Behind Enemy Lines -- Mission 6</w:t>
+      </w:r>
+      <w:r>
+        <w:t>_</w:t>
+      </w:r>
+      <w:r>
+        <w:t xml:space="preserve"> Menace of the Leopold</w:t>
       </w:r>
       <w:r>
         <w:t>.mp4</w:t>
@@ -1491,13 +1527,22 @@
         <w:t>: [</w:t>
       </w:r>
       <w:r>
-        <w:t xml:space="preserve">Commandos- Behind Enemy Lines -- Mission </w:t>
+        <w:t>Commandos</w:t>
+      </w:r>
+      <w:r>
+        <w:t>_</w:t>
+      </w:r>
+      <w:r>
+        <w:t xml:space="preserve"> Behind Enemy Lines -- Mission </w:t>
       </w:r>
       <w:r>
         <w:t>7</w:t>
       </w:r>
       <w:r>
-        <w:t xml:space="preserve">- </w:t>
+        <w:t>_</w:t>
+      </w:r>
+      <w:r>
+        <w:t xml:space="preserve"> </w:t>
       </w:r>
       <w:r>
         <w:t>Chase of the Wolves</w:t>
@@ -1739,10 +1784,16 @@
         <w:t>: [</w:t>
       </w:r>
       <w:r>
-        <w:t>Commandos: Behind Enemy Lines -- Mission 8</w:t>
-      </w:r>
-      <w:r>
-        <w:t>-</w:t>
+        <w:t>Commandos</w:t>
+      </w:r>
+      <w:r>
+        <w:t>_</w:t>
+      </w:r>
+      <w:r>
+        <w:t xml:space="preserve"> Behind Enemy Lines -- Mission 8</w:t>
+      </w:r>
+      <w:r>
+        <w:t>_</w:t>
       </w:r>
       <w:r>
         <w:t xml:space="preserve"> Pyrotechnics</w:t>
@@ -1989,10 +2040,16 @@
         <w:t>: [</w:t>
       </w:r>
       <w:r>
-        <w:t>Commandos: Behind Enemy Lines -- Mission 9</w:t>
-      </w:r>
-      <w:r>
-        <w:t>-</w:t>
+        <w:t>Commandos</w:t>
+      </w:r>
+      <w:r>
+        <w:t>_</w:t>
+      </w:r>
+      <w:r>
+        <w:t xml:space="preserve"> Behind Enemy Lines -- Mission 9</w:t>
+      </w:r>
+      <w:r>
+        <w:t>_</w:t>
       </w:r>
       <w:r>
         <w:t xml:space="preserve"> A Courtesy Call</w:t>
@@ -2228,13 +2285,19 @@
         <w:t>: [</w:t>
       </w:r>
       <w:r>
-        <w:t xml:space="preserve">Commandos: Behind Enemy Lines -- Mission </w:t>
+        <w:t>Commandos</w:t>
+      </w:r>
+      <w:r>
+        <w:t>_</w:t>
+      </w:r>
+      <w:r>
+        <w:t xml:space="preserve"> Behind Enemy Lines -- Mission </w:t>
       </w:r>
       <w:r>
         <w:t>10</w:t>
       </w:r>
       <w:r>
-        <w:t>-</w:t>
+        <w:t>_</w:t>
       </w:r>
       <w:r>
         <w:t xml:space="preserve"> A Courtesy Call</w:t>
@@ -2433,6 +2496,227 @@
       </w:r>
       <w:r>
         <w:br/>
+        <w:t xml:space="preserve">* </w:t>
+      </w:r>
+      <w:r>
+        <w:rPr>
+          <w:b/>
+          <w:bCs/>
+        </w:rPr>
+        <w:t>Notes</w:t>
+      </w:r>
+      <w:r>
+        <w:t>:</w:t>
+      </w:r>
+    </w:p>
+    <w:p>
+      <w:pPr>
+        <w:ind w:left="720"/>
+      </w:pPr>
+    </w:p>
+    <w:p>
+      <w:pPr>
+        <w:ind w:left="720"/>
+      </w:pPr>
+    </w:p>
+    <w:p>
+      <w:pPr>
+        <w:ind w:left="720"/>
+      </w:pPr>
+    </w:p>
+    <w:p>
+      <w:pPr>
+        <w:pStyle w:val="ListParagraph"/>
+        <w:numPr>
+          <w:ilvl w:val="0"/>
+          <w:numId w:val="2"/>
+        </w:numPr>
+      </w:pPr>
+      <w:r>
+        <w:t xml:space="preserve">* </w:t>
+      </w:r>
+      <w:r>
+        <w:rPr>
+          <w:b/>
+          <w:bCs/>
+        </w:rPr>
+        <w:t>Download Name</w:t>
+      </w:r>
+      <w:r>
+        <w:t>: [Commandos_ Behind Enemy Lines -- Mission 11_ In the Soup.mp4] [Commandos: Behind Enemy Lines -- Mission 11: In the Soup]</w:t>
+      </w:r>
+    </w:p>
+    <w:p>
+      <w:pPr>
+        <w:ind w:left="720"/>
+      </w:pPr>
+      <w:r>
+        <w:t xml:space="preserve">* </w:t>
+      </w:r>
+      <w:r>
+        <w:rPr>
+          <w:b/>
+          <w:bCs/>
+        </w:rPr>
+        <w:t>Download Type</w:t>
+      </w:r>
+      <w:r>
+        <w:t>: Video</w:t>
+      </w:r>
+    </w:p>
+    <w:p>
+      <w:pPr>
+        <w:ind w:left="720"/>
+      </w:pPr>
+      <w:r>
+        <w:t xml:space="preserve">* </w:t>
+      </w:r>
+      <w:r>
+        <w:rPr>
+          <w:b/>
+          <w:bCs/>
+        </w:rPr>
+        <w:t>Source Type</w:t>
+      </w:r>
+      <w:r>
+        <w:t>: Entertainment</w:t>
+      </w:r>
+    </w:p>
+    <w:p>
+      <w:pPr>
+        <w:ind w:left="720"/>
+      </w:pPr>
+      <w:r>
+        <w:t xml:space="preserve">* </w:t>
+      </w:r>
+      <w:r>
+        <w:rPr>
+          <w:b/>
+          <w:bCs/>
+        </w:rPr>
+        <w:t>Download Source</w:t>
+      </w:r>
+      <w:r>
+        <w:t xml:space="preserve">: </w:t>
+      </w:r>
+      <w:hyperlink r:id="rId15" w:history="1">
+        <w:r>
+          <w:rPr>
+            <w:rStyle w:val="Hyperlink"/>
+          </w:rPr>
+          <w:t>https://www.youtube.com/watch?v=_wkCHWtsQto&amp;list=PL2ikZcZeJZa8a6fq6w4IvqOsAenfgody3&amp;index=11</w:t>
+        </w:r>
+      </w:hyperlink>
+      <w:r>
+        <w:t xml:space="preserve"> </w:t>
+      </w:r>
+      <w:r>
+        <w:t xml:space="preserve"> </w:t>
+      </w:r>
+    </w:p>
+    <w:p>
+      <w:pPr>
+        <w:ind w:left="720"/>
+      </w:pPr>
+      <w:r>
+        <w:t xml:space="preserve">* </w:t>
+      </w:r>
+      <w:r>
+        <w:rPr>
+          <w:b/>
+          <w:bCs/>
+        </w:rPr>
+        <w:t>Download Method</w:t>
+      </w:r>
+      <w:r>
+        <w:t>: IDM</w:t>
+      </w:r>
+    </w:p>
+    <w:p>
+      <w:pPr>
+        <w:ind w:left="720"/>
+      </w:pPr>
+      <w:r>
+        <w:t xml:space="preserve">* </w:t>
+      </w:r>
+      <w:r>
+        <w:rPr>
+          <w:b/>
+          <w:bCs/>
+        </w:rPr>
+        <w:t>Download Format</w:t>
+      </w:r>
+      <w:r>
+        <w:t>: .mp4</w:t>
+      </w:r>
+    </w:p>
+    <w:p>
+      <w:pPr>
+        <w:ind w:left="720"/>
+      </w:pPr>
+      <w:r>
+        <w:t xml:space="preserve">* </w:t>
+      </w:r>
+      <w:r>
+        <w:rPr>
+          <w:b/>
+          <w:bCs/>
+        </w:rPr>
+        <w:t>Download Quality</w:t>
+      </w:r>
+      <w:r>
+        <w:t>: 720p HD - Medium (HD Ready)</w:t>
+      </w:r>
+    </w:p>
+    <w:p>
+      <w:pPr>
+        <w:ind w:left="720"/>
+      </w:pPr>
+      <w:r>
+        <w:t xml:space="preserve">* </w:t>
+      </w:r>
+      <w:r>
+        <w:rPr>
+          <w:b/>
+          <w:bCs/>
+        </w:rPr>
+        <w:t>Download Date</w:t>
+      </w:r>
+      <w:r>
+        <w:t>: 9/14/2025</w:t>
+      </w:r>
+    </w:p>
+    <w:p>
+      <w:pPr>
+        <w:ind w:left="720"/>
+      </w:pPr>
+      <w:r>
+        <w:t xml:space="preserve">* </w:t>
+      </w:r>
+      <w:r>
+        <w:rPr>
+          <w:b/>
+          <w:bCs/>
+        </w:rPr>
+        <w:t>Saved Location</w:t>
+      </w:r>
+      <w:r>
+        <w:t>: KINGSTON Games (F:)/Games</w:t>
+      </w:r>
+      <w:proofErr w:type="gramStart"/>
+      <w:r>
+        <w:t>/..</w:t>
+      </w:r>
+      <w:proofErr w:type="gramEnd"/>
+      <w:r>
+        <w:t xml:space="preserve"> </w:t>
+      </w:r>
+    </w:p>
+    <w:p>
+      <w:pPr>
+        <w:ind w:left="720"/>
+      </w:pPr>
+      <w:r>
         <w:t xml:space="preserve">* </w:t>
       </w:r>
       <w:r>

</xml_diff>